<commit_message>
Align student details, colons, and fields on Front Cover
</commit_message>
<xml_diff>
--- a/FRONT_PAGE.docx
+++ b/FRONT_PAGE.docx
@@ -506,12 +506,12 @@
                         </wps:bodyPr>
                       </wps:wsp>
                       <wps:wsp>
-                        <wps:cNvPr id="23" name="Rectangle 23"/>
-                        <wps:cNvSpPr/>
-                        <wps:spPr>
-                          <a:xfrm>
-                            <a:off x="152400" y="6399204"/>
-                            <a:ext cx="353191" cy="443448"/>
+                        <wps:cNvPr id="2001" name="Rectangle StudentInfo"/>
+                        <wps:cNvSpPr/>
+                        <wps:spPr>
+                          <a:xfrm>
+                            <a:off x="600000" y="6150000"/>
+                            <a:ext cx="6000000" cy="3400000"/>
                           </a:xfrm>
                           <a:prstGeom prst="rect">
                             <a:avLst/>
@@ -523,72 +523,35 @@
                         <wps:txbx>
                           <w:txbxContent>
                             <w:p>
+                              <w:pPr>
+                                <w:tabs>
+                                  <w:tab w:val="left" w:pos="2500"/>
+                                  <w:tab w:val="left" w:pos="2850"/>
+                                </w:tabs>
+                                <w:spacing w:line="910" w:lineRule="exact" w:before="0" w:after="0"/>
+                              </w:pPr>
                               <w:r>
                                 <w:rPr>
                                   <w:rFonts w:ascii="Arial Rounded MT" w:eastAsia="Arial Rounded MT" w:hAnsi="Arial Rounded MT" w:cs="Arial Rounded MT"/>
                                   <w:b/>
                                   <w:sz w:val="56"/>
                                 </w:rPr>
-                                <w:t xml:space="preserve">   </w:t>
+                                <w:t>NAME</w:t>
                               </w:r>
-                            </w:p>
-                          </w:txbxContent>
-                        </wps:txbx>
-                        <wps:bodyPr horzOverflow="overflow" vert="horz" lIns="0" tIns="0" rIns="0" bIns="0" rtlCol="0">
-                          <a:noAutofit/>
-                        </wps:bodyPr>
-                      </wps:wsp>
-                      <wps:wsp>
-                        <wps:cNvPr id="24" name="Rectangle 24"/>
-                        <wps:cNvSpPr/>
-                        <wps:spPr>
-                          <a:xfrm>
-                            <a:off x="417576" y="6399204"/>
-                            <a:ext cx="2502571" cy="443448"/>
-                          </a:xfrm>
-                          <a:prstGeom prst="rect">
-                            <a:avLst/>
-                          </a:prstGeom>
-                          <a:ln>
-                            <a:noFill/>
-                          </a:ln>
-                        </wps:spPr>
-                        <wps:txbx>
-                          <w:txbxContent>
-                            <w:p>
+                              <w:r>
+                                <w:tab/>
+                              </w:r>
                               <w:r>
                                 <w:rPr>
                                   <w:rFonts w:ascii="Arial Rounded MT" w:eastAsia="Arial Rounded MT" w:hAnsi="Arial Rounded MT" w:cs="Arial Rounded MT"/>
                                   <w:b/>
                                   <w:sz w:val="56"/>
                                 </w:rPr>
-                                <w:t>NAME        :</w:t>
+                                <w:t>:</w:t>
                               </w:r>
-                            </w:p>
-                          </w:txbxContent>
-                        </wps:txbx>
-                        <wps:bodyPr horzOverflow="overflow" vert="horz" lIns="0" tIns="0" rIns="0" bIns="0" rtlCol="0">
-                          <a:noAutofit/>
-                        </wps:bodyPr>
-                      </wps:wsp>
-                      <wps:wsp>
-                        <wps:cNvPr id="956" name="Rectangle 956"/>
-                        <wps:cNvSpPr/>
-                        <wps:spPr>
-                          <a:xfrm>
-                            <a:off x="2300351" y="6381519"/>
-                            <a:ext cx="3876884" cy="472272"/>
-                          </a:xfrm>
-                          <a:prstGeom prst="rect">
-                            <a:avLst/>
-                          </a:prstGeom>
-                          <a:ln>
-                            <a:noFill/>
-                          </a:ln>
-                        </wps:spPr>
-                        <wps:txbx>
-                          <w:txbxContent>
-                            <w:p>
+                              <w:r>
+                                <w:tab/>
+                              </w:r>
                               <w:r>
                                 <w:rPr>
                                   <w:rFonts w:ascii="Cambria" w:eastAsia="Cambria" w:hAnsi="Cambria" w:cs="Cambria"/>
@@ -599,96 +562,14 @@
                                 <w:t>Riddhiman Ghosh</w:t>
                               </w:r>
                             </w:p>
-                          </w:txbxContent>
-                        </wps:txbx>
-                        <wps:bodyPr horzOverflow="overflow" vert="horz" lIns="0" tIns="0" rIns="0" bIns="0" rtlCol="0">
-                          <a:noAutofit/>
-                        </wps:bodyPr>
-                      </wps:wsp>
-                      <wps:wsp>
-                        <wps:cNvPr id="957" name="Rectangle 957"/>
-                        <wps:cNvSpPr/>
-                        <wps:spPr>
-                          <a:xfrm>
-                            <a:off x="5217541" y="6381519"/>
-                            <a:ext cx="103900" cy="472272"/>
-                          </a:xfrm>
-                          <a:prstGeom prst="rect">
-                            <a:avLst/>
-                          </a:prstGeom>
-                          <a:ln>
-                            <a:noFill/>
-                          </a:ln>
-                        </wps:spPr>
-                        <wps:txbx>
-                          <w:txbxContent>
                             <w:p>
-                              <w:r>
-                                <w:rPr>
-                                  <w:rFonts w:ascii="Cambria" w:eastAsia="Cambria" w:hAnsi="Cambria" w:cs="Cambria"/>
-                                  <w:b/>
-                                  <w:sz w:val="56"/>
-                                </w:rPr>
-                                <w:t xml:space="preserve"> </w:t>
-                              </w:r>
-                            </w:p>
-                          </w:txbxContent>
-                        </wps:txbx>
-                        <wps:bodyPr horzOverflow="overflow" vert="horz" lIns="0" tIns="0" rIns="0" bIns="0" rtlCol="0">
-                          <a:noAutofit/>
-                        </wps:bodyPr>
-                      </wps:wsp>
-                      <wps:wsp>
-                        <wps:cNvPr id="28" name="Rectangle 28"/>
-                        <wps:cNvSpPr/>
-                        <wps:spPr>
-                          <a:xfrm>
-                            <a:off x="266700" y="7030140"/>
-                            <a:ext cx="118068" cy="443448"/>
-                          </a:xfrm>
-                          <a:prstGeom prst="rect">
-                            <a:avLst/>
-                          </a:prstGeom>
-                          <a:ln>
-                            <a:noFill/>
-                          </a:ln>
-                        </wps:spPr>
-                        <wps:txbx>
-                          <w:txbxContent>
-                            <w:p>
-                              <w:r>
-                                <w:rPr>
-                                  <w:rFonts w:ascii="Arial Rounded MT" w:eastAsia="Arial Rounded MT" w:hAnsi="Arial Rounded MT" w:cs="Arial Rounded MT"/>
-                                  <w:b/>
-                                  <w:sz w:val="56"/>
-                                </w:rPr>
-                                <w:t xml:space="preserve"> </w:t>
-                              </w:r>
-                            </w:p>
-                          </w:txbxContent>
-                        </wps:txbx>
-                        <wps:bodyPr horzOverflow="overflow" vert="horz" lIns="0" tIns="0" rIns="0" bIns="0" rtlCol="0">
-                          <a:noAutofit/>
-                        </wps:bodyPr>
-                      </wps:wsp>
-                      <wps:wsp>
-                        <wps:cNvPr id="29" name="Rectangle 29"/>
-                        <wps:cNvSpPr/>
-                        <wps:spPr>
-                          <a:xfrm>
-                            <a:off x="355092" y="7030140"/>
-                            <a:ext cx="1605726" cy="443448"/>
-                          </a:xfrm>
-                          <a:prstGeom prst="rect">
-                            <a:avLst/>
-                          </a:prstGeom>
-                          <a:ln>
-                            <a:noFill/>
-                          </a:ln>
-                        </wps:spPr>
-                        <wps:txbx>
-                          <w:txbxContent>
-                            <w:p>
+                              <w:pPr>
+                                <w:tabs>
+                                  <w:tab w:val="left" w:pos="2500"/>
+                                  <w:tab w:val="left" w:pos="2850"/>
+                                </w:tabs>
+                                <w:spacing w:line="910" w:lineRule="exact" w:before="0" w:after="0"/>
+                              </w:pPr>
                               <w:r>
                                 <w:rPr>
                                   <w:rFonts w:ascii="Arial Rounded MT" w:eastAsia="Arial Rounded MT" w:hAnsi="Arial Rounded MT" w:cs="Arial Rounded MT"/>
@@ -697,125 +578,9 @@
                                 </w:rPr>
                                 <w:t>CLASS</w:t>
                               </w:r>
-                            </w:p>
-                          </w:txbxContent>
-                        </wps:txbx>
-                        <wps:bodyPr horzOverflow="overflow" vert="horz" lIns="0" tIns="0" rIns="0" bIns="0" rtlCol="0">
-                          <a:noAutofit/>
-                        </wps:bodyPr>
-                      </wps:wsp>
-                      <wps:wsp>
-                        <wps:cNvPr id="30" name="Rectangle 30"/>
-                        <wps:cNvSpPr/>
-                        <wps:spPr>
-                          <a:xfrm>
-                            <a:off x="1562354" y="7030140"/>
-                            <a:ext cx="118068" cy="443448"/>
-                          </a:xfrm>
-                          <a:prstGeom prst="rect">
-                            <a:avLst/>
-                          </a:prstGeom>
-                          <a:ln>
-                            <a:noFill/>
-                          </a:ln>
-                        </wps:spPr>
-                        <wps:txbx>
-                          <w:txbxContent>
-                            <w:p>
                               <w:r>
-                                <w:rPr>
-                                  <w:rFonts w:ascii="Arial Rounded MT" w:eastAsia="Arial Rounded MT" w:hAnsi="Arial Rounded MT" w:cs="Arial Rounded MT"/>
-                                  <w:b/>
-                                  <w:sz w:val="56"/>
-                                </w:rPr>
-                                <w:t xml:space="preserve"> </w:t>
+                                <w:tab/>
                               </w:r>
-                            </w:p>
-                          </w:txbxContent>
-                        </wps:txbx>
-                        <wps:bodyPr horzOverflow="overflow" vert="horz" lIns="0" tIns="0" rIns="0" bIns="0" rtlCol="0">
-                          <a:noAutofit/>
-                        </wps:bodyPr>
-                      </wps:wsp>
-                      <wps:wsp>
-                        <wps:cNvPr id="31" name="Rectangle 31"/>
-                        <wps:cNvSpPr/>
-                        <wps:spPr>
-                          <a:xfrm>
-                            <a:off x="1652270" y="7183501"/>
-                            <a:ext cx="42144" cy="189936"/>
-                          </a:xfrm>
-                          <a:prstGeom prst="rect">
-                            <a:avLst/>
-                          </a:prstGeom>
-                          <a:ln>
-                            <a:noFill/>
-                          </a:ln>
-                        </wps:spPr>
-                        <wps:txbx>
-                          <w:txbxContent>
-                            <w:p>
-                              <w:r>
-                                <w:t xml:space="preserve"> </w:t>
-                              </w:r>
-                            </w:p>
-                          </w:txbxContent>
-                        </wps:txbx>
-                        <wps:bodyPr horzOverflow="overflow" vert="horz" lIns="0" tIns="0" rIns="0" bIns="0" rtlCol="0">
-                          <a:noAutofit/>
-                        </wps:bodyPr>
-                      </wps:wsp>
-                      <wps:wsp>
-                        <wps:cNvPr id="32" name="Rectangle 32"/>
-                        <wps:cNvSpPr/>
-                        <wps:spPr>
-                          <a:xfrm>
-                            <a:off x="1981454" y="7030140"/>
-                            <a:ext cx="235629" cy="443448"/>
-                          </a:xfrm>
-                          <a:prstGeom prst="rect">
-                            <a:avLst/>
-                          </a:prstGeom>
-                          <a:ln>
-                            <a:noFill/>
-                          </a:ln>
-                        </wps:spPr>
-                        <wps:txbx>
-                          <w:txbxContent>
-                            <w:p>
-                              <w:r>
-                                <w:rPr>
-                                  <w:rFonts w:ascii="Arial Rounded MT" w:eastAsia="Arial Rounded MT" w:hAnsi="Arial Rounded MT" w:cs="Arial Rounded MT"/>
-                                  <w:b/>
-                                  <w:sz w:val="56"/>
-                                </w:rPr>
-                                <w:t xml:space="preserve">  </w:t>
-                              </w:r>
-                            </w:p>
-                          </w:txbxContent>
-                        </wps:txbx>
-                        <wps:bodyPr horzOverflow="overflow" vert="horz" lIns="0" tIns="0" rIns="0" bIns="0" rtlCol="0">
-                          <a:noAutofit/>
-                        </wps:bodyPr>
-                      </wps:wsp>
-                      <wps:wsp>
-                        <wps:cNvPr id="33" name="Rectangle 33"/>
-                        <wps:cNvSpPr/>
-                        <wps:spPr>
-                          <a:xfrm>
-                            <a:off x="2158238" y="7030140"/>
-                            <a:ext cx="147821" cy="443448"/>
-                          </a:xfrm>
-                          <a:prstGeom prst="rect">
-                            <a:avLst/>
-                          </a:prstGeom>
-                          <a:ln>
-                            <a:noFill/>
-                          </a:ln>
-                        </wps:spPr>
-                        <wps:txbx>
-                          <w:txbxContent>
-                            <w:p>
                               <w:r>
                                 <w:rPr>
                                   <w:rFonts w:ascii="Arial Rounded MT" w:eastAsia="Arial Rounded MT" w:hAnsi="Arial Rounded MT" w:cs="Arial Rounded MT"/>
@@ -824,64 +589,9 @@
                                 </w:rPr>
                                 <w:t>:</w:t>
                               </w:r>
-                            </w:p>
-                          </w:txbxContent>
-                        </wps:txbx>
-                        <wps:bodyPr horzOverflow="overflow" vert="horz" lIns="0" tIns="0" rIns="0" bIns="0" rtlCol="0">
-                          <a:noAutofit/>
-                        </wps:bodyPr>
-                      </wps:wsp>
-                      <wps:wsp>
-                        <wps:cNvPr id="34" name="Rectangle 34"/>
-                        <wps:cNvSpPr/>
-                        <wps:spPr>
-                          <a:xfrm>
-                            <a:off x="2269871" y="6984887"/>
-                            <a:ext cx="159156" cy="557595"/>
-                          </a:xfrm>
-                          <a:prstGeom prst="rect">
-                            <a:avLst/>
-                          </a:prstGeom>
-                          <a:ln>
-                            <a:noFill/>
-                          </a:ln>
-                        </wps:spPr>
-                        <wps:txbx>
-                          <w:txbxContent>
-                            <w:p>
                               <w:r>
-                                <w:rPr>
-                                  <w:rFonts w:ascii="Lucida Handwriting" w:eastAsia="Lucida Handwriting" w:hAnsi="Lucida Handwriting" w:cs="Lucida Handwriting"/>
-                                  <w:i/>
-                                  <w:sz w:val="56"/>
-                                </w:rPr>
-                                <w:t xml:space="preserve"> </w:t>
+                                <w:tab/>
                               </w:r>
-                            </w:p>
-                          </w:txbxContent>
-                        </wps:txbx>
-                        <wps:bodyPr horzOverflow="overflow" vert="horz" lIns="0" tIns="0" rIns="0" bIns="0" rtlCol="0">
-                          <a:noAutofit/>
-                        </wps:bodyPr>
-                      </wps:wsp>
-                      <wps:wsp>
-                        <wps:cNvPr id="958" name="Rectangle 958"/>
-                        <wps:cNvSpPr/>
-                        <wps:spPr>
-                          <a:xfrm>
-                            <a:off x="2390267" y="7012455"/>
-                            <a:ext cx="622927" cy="472273"/>
-                          </a:xfrm>
-                          <a:prstGeom prst="rect">
-                            <a:avLst/>
-                          </a:prstGeom>
-                          <a:ln>
-                            <a:noFill/>
-                          </a:ln>
-                        </wps:spPr>
-                        <wps:txbx>
-                          <w:txbxContent>
-                            <w:p>
                               <w:r>
                                 <w:rPr>
                                   <w:rFonts w:ascii="Cambria" w:eastAsia="Cambria" w:hAnsi="Cambria" w:cs="Cambria"/>
@@ -892,195 +602,25 @@
                                 <w:t>XII</w:t>
                               </w:r>
                             </w:p>
-                          </w:txbxContent>
-                        </wps:txbx>
-                        <wps:bodyPr horzOverflow="overflow" vert="horz" lIns="0" tIns="0" rIns="0" bIns="0" rtlCol="0">
-                          <a:noAutofit/>
-                        </wps:bodyPr>
-                      </wps:wsp>
-                      <wps:wsp>
-                        <wps:cNvPr id="959" name="Rectangle 959"/>
-                        <wps:cNvSpPr/>
-                        <wps:spPr>
-                          <a:xfrm>
-                            <a:off x="2858634" y="7012455"/>
-                            <a:ext cx="103900" cy="472273"/>
-                          </a:xfrm>
-                          <a:prstGeom prst="rect">
-                            <a:avLst/>
-                          </a:prstGeom>
-                          <a:ln>
-                            <a:noFill/>
-                          </a:ln>
-                        </wps:spPr>
-                        <wps:txbx>
-                          <w:txbxContent>
                             <w:p>
-                              <w:r>
-                                <w:rPr>
-                                  <w:rFonts w:ascii="Cambria" w:eastAsia="Cambria" w:hAnsi="Cambria" w:cs="Cambria"/>
-                                  <w:b/>
-                                  <w:sz w:val="56"/>
-                                </w:rPr>
-                                <w:t xml:space="preserve"> </w:t>
-                              </w:r>
-                            </w:p>
-                          </w:txbxContent>
-                        </wps:txbx>
-                        <wps:bodyPr horzOverflow="overflow" vert="horz" lIns="0" tIns="0" rIns="0" bIns="0" rtlCol="0">
-                          <a:noAutofit/>
-                        </wps:bodyPr>
-                      </wps:wsp>
-                      <wps:wsp>
-                        <wps:cNvPr id="36" name="Rectangle 36"/>
-                        <wps:cNvSpPr/>
-                        <wps:spPr>
-                          <a:xfrm>
-                            <a:off x="2937383" y="6984887"/>
-                            <a:ext cx="159156" cy="557595"/>
-                          </a:xfrm>
-                          <a:prstGeom prst="rect">
-                            <a:avLst/>
-                          </a:prstGeom>
-                          <a:ln>
-                            <a:noFill/>
-                          </a:ln>
-                        </wps:spPr>
-                        <wps:txbx>
-                          <w:txbxContent>
-                            <w:p>
-                              <w:r>
-                                <w:rPr>
-                                  <w:rFonts w:ascii="Lucida Handwriting" w:eastAsia="Lucida Handwriting" w:hAnsi="Lucida Handwriting" w:cs="Lucida Handwriting"/>
-                                  <w:i/>
-                                  <w:sz w:val="56"/>
-                                </w:rPr>
-                                <w:t xml:space="preserve"> </w:t>
-                              </w:r>
-                            </w:p>
-                          </w:txbxContent>
-                        </wps:txbx>
-                        <wps:bodyPr horzOverflow="overflow" vert="horz" lIns="0" tIns="0" rIns="0" bIns="0" rtlCol="0">
-                          <a:noAutofit/>
-                        </wps:bodyPr>
-                      </wps:wsp>
-                      <wps:wsp>
-                        <wps:cNvPr id="38" name="Rectangle 38"/>
-                        <wps:cNvSpPr/>
-                        <wps:spPr>
-                          <a:xfrm>
-                            <a:off x="152400" y="7617347"/>
-                            <a:ext cx="319283" cy="557595"/>
-                          </a:xfrm>
-                          <a:prstGeom prst="rect">
-                            <a:avLst/>
-                          </a:prstGeom>
-                          <a:ln>
-                            <a:noFill/>
-                          </a:ln>
-                        </wps:spPr>
-                        <wps:txbx>
-                          <w:txbxContent>
-                            <w:p>
-                              <w:r>
-                                <w:rPr>
-                                  <w:rFonts w:ascii="Lucida Handwriting" w:eastAsia="Lucida Handwriting" w:hAnsi="Lucida Handwriting" w:cs="Lucida Handwriting"/>
-                                  <w:i/>
-                                  <w:sz w:val="56"/>
-                                </w:rPr>
-                                <w:t xml:space="preserve">  </w:t>
-                              </w:r>
-                            </w:p>
-                          </w:txbxContent>
-                        </wps:txbx>
-                        <wps:bodyPr horzOverflow="overflow" vert="horz" lIns="0" tIns="0" rIns="0" bIns="0" rtlCol="0">
-                          <a:noAutofit/>
-                        </wps:bodyPr>
-                      </wps:wsp>
-                      <wps:wsp>
-                        <wps:cNvPr id="39" name="Rectangle 39"/>
-                        <wps:cNvSpPr/>
-                        <wps:spPr>
-                          <a:xfrm>
-                            <a:off x="393192" y="7662601"/>
-                            <a:ext cx="2115780" cy="443446"/>
-                          </a:xfrm>
-                          <a:prstGeom prst="rect">
-                            <a:avLst/>
-                          </a:prstGeom>
-                          <a:ln>
-                            <a:noFill/>
-                          </a:ln>
-                        </wps:spPr>
-                        <wps:txbx>
-                          <w:txbxContent>
-                            <w:p>
+                              <w:pPr>
+                                <w:tabs>
+                                  <w:tab w:val="left" w:pos="2500"/>
+                                  <w:tab w:val="left" w:pos="2850"/>
+                                </w:tabs>
+                                <w:spacing w:line="910" w:lineRule="exact" w:before="0" w:after="0"/>
+                              </w:pPr>
                               <w:r>
                                 <w:rPr>
                                   <w:rFonts w:ascii="Arial Rounded MT" w:eastAsia="Arial Rounded MT" w:hAnsi="Arial Rounded MT" w:cs="Arial Rounded MT"/>
                                   <w:b/>
                                   <w:sz w:val="56"/>
                                 </w:rPr>
-                                <w:t xml:space="preserve">STREAM </w:t>
+                                <w:t>STREAM</w:t>
                               </w:r>
-                            </w:p>
-                          </w:txbxContent>
-                        </wps:txbx>
-                        <wps:bodyPr horzOverflow="overflow" vert="horz" lIns="0" tIns="0" rIns="0" bIns="0" rtlCol="0">
-                          <a:noAutofit/>
-                        </wps:bodyPr>
-                      </wps:wsp>
-                      <wps:wsp>
-                        <wps:cNvPr id="40" name="Rectangle 40"/>
-                        <wps:cNvSpPr/>
-                        <wps:spPr>
-                          <a:xfrm>
-                            <a:off x="1984502" y="7662601"/>
-                            <a:ext cx="118068" cy="443446"/>
-                          </a:xfrm>
-                          <a:prstGeom prst="rect">
-                            <a:avLst/>
-                          </a:prstGeom>
-                          <a:ln>
-                            <a:noFill/>
-                          </a:ln>
-                        </wps:spPr>
-                        <wps:txbx>
-                          <w:txbxContent>
-                            <w:p>
                               <w:r>
-                                <w:rPr>
-                                  <w:rFonts w:ascii="Arial Rounded MT" w:eastAsia="Arial Rounded MT" w:hAnsi="Arial Rounded MT" w:cs="Arial Rounded MT"/>
-                                  <w:b/>
-                                  <w:sz w:val="56"/>
-                                </w:rPr>
-                                <w:t xml:space="preserve"> </w:t>
+                                <w:tab/>
                               </w:r>
-                            </w:p>
-                          </w:txbxContent>
-                        </wps:txbx>
-                        <wps:bodyPr horzOverflow="overflow" vert="horz" lIns="0" tIns="0" rIns="0" bIns="0" rtlCol="0">
-                          <a:noAutofit/>
-                        </wps:bodyPr>
-                      </wps:wsp>
-                      <wps:wsp>
-                        <wps:cNvPr id="41" name="Rectangle 41"/>
-                        <wps:cNvSpPr/>
-                        <wps:spPr>
-                          <a:xfrm>
-                            <a:off x="2072894" y="7662601"/>
-                            <a:ext cx="147821" cy="443446"/>
-                          </a:xfrm>
-                          <a:prstGeom prst="rect">
-                            <a:avLst/>
-                          </a:prstGeom>
-                          <a:ln>
-                            <a:noFill/>
-                          </a:ln>
-                        </wps:spPr>
-                        <wps:txbx>
-                          <w:txbxContent>
-                            <w:p>
                               <w:r>
                                 <w:rPr>
                                   <w:rFonts w:ascii="Arial Rounded MT" w:eastAsia="Arial Rounded MT" w:hAnsi="Arial Rounded MT" w:cs="Arial Rounded MT"/>
@@ -1089,64 +629,9 @@
                                 </w:rPr>
                                 <w:t>:</w:t>
                               </w:r>
-                            </w:p>
-                          </w:txbxContent>
-                        </wps:txbx>
-                        <wps:bodyPr horzOverflow="overflow" vert="horz" lIns="0" tIns="0" rIns="0" bIns="0" rtlCol="0">
-                          <a:noAutofit/>
-                        </wps:bodyPr>
-                      </wps:wsp>
-                      <wps:wsp>
-                        <wps:cNvPr id="42" name="Rectangle 42"/>
-                        <wps:cNvSpPr/>
-                        <wps:spPr>
-                          <a:xfrm>
-                            <a:off x="2184527" y="7617347"/>
-                            <a:ext cx="159156" cy="557595"/>
-                          </a:xfrm>
-                          <a:prstGeom prst="rect">
-                            <a:avLst/>
-                          </a:prstGeom>
-                          <a:ln>
-                            <a:noFill/>
-                          </a:ln>
-                        </wps:spPr>
-                        <wps:txbx>
-                          <w:txbxContent>
-                            <w:p>
                               <w:r>
-                                <w:rPr>
-                                  <w:rFonts w:ascii="Lucida Handwriting" w:eastAsia="Lucida Handwriting" w:hAnsi="Lucida Handwriting" w:cs="Lucida Handwriting"/>
-                                  <w:i/>
-                                  <w:sz w:val="56"/>
-                                </w:rPr>
-                                <w:t xml:space="preserve"> </w:t>
+                                <w:tab/>
                               </w:r>
-                            </w:p>
-                          </w:txbxContent>
-                        </wps:txbx>
-                        <wps:bodyPr horzOverflow="overflow" vert="horz" lIns="0" tIns="0" rIns="0" bIns="0" rtlCol="0">
-                          <a:noAutofit/>
-                        </wps:bodyPr>
-                      </wps:wsp>
-                      <wps:wsp>
-                        <wps:cNvPr id="960" name="Rectangle 960"/>
-                        <wps:cNvSpPr/>
-                        <wps:spPr>
-                          <a:xfrm>
-                            <a:off x="2304923" y="7644915"/>
-                            <a:ext cx="1622728" cy="472273"/>
-                          </a:xfrm>
-                          <a:prstGeom prst="rect">
-                            <a:avLst/>
-                          </a:prstGeom>
-                          <a:ln>
-                            <a:noFill/>
-                          </a:ln>
-                        </wps:spPr>
-                        <wps:txbx>
-                          <w:txbxContent>
-                            <w:p>
                               <w:r>
                                 <w:rPr>
                                   <w:rFonts w:ascii="Cambria" w:eastAsia="Cambria" w:hAnsi="Cambria" w:cs="Cambria"/>
@@ -1157,96 +642,14 @@
                                 <w:t>Science</w:t>
                               </w:r>
                             </w:p>
-                          </w:txbxContent>
-                        </wps:txbx>
-                        <wps:bodyPr horzOverflow="overflow" vert="horz" lIns="0" tIns="0" rIns="0" bIns="0" rtlCol="0">
-                          <a:noAutofit/>
-                        </wps:bodyPr>
-                      </wps:wsp>
-                      <wps:wsp>
-                        <wps:cNvPr id="961" name="Rectangle 961"/>
-                        <wps:cNvSpPr/>
-                        <wps:spPr>
-                          <a:xfrm>
-                            <a:off x="3525647" y="7617347"/>
-                            <a:ext cx="159156" cy="557595"/>
-                          </a:xfrm>
-                          <a:prstGeom prst="rect">
-                            <a:avLst/>
-                          </a:prstGeom>
-                          <a:ln>
-                            <a:noFill/>
-                          </a:ln>
-                        </wps:spPr>
-                        <wps:txbx>
-                          <w:txbxContent>
                             <w:p>
-                              <w:r>
-                                <w:rPr>
-                                  <w:rFonts w:ascii="Lucida Handwriting" w:eastAsia="Lucida Handwriting" w:hAnsi="Lucida Handwriting" w:cs="Lucida Handwriting"/>
-                                  <w:i/>
-                                  <w:sz w:val="56"/>
-                                </w:rPr>
-                                <w:t xml:space="preserve"> </w:t>
-                              </w:r>
-                            </w:p>
-                          </w:txbxContent>
-                        </wps:txbx>
-                        <wps:bodyPr horzOverflow="overflow" vert="horz" lIns="0" tIns="0" rIns="0" bIns="0" rtlCol="0">
-                          <a:noAutofit/>
-                        </wps:bodyPr>
-                      </wps:wsp>
-                      <wps:wsp>
-                        <wps:cNvPr id="46" name="Rectangle 46"/>
-                        <wps:cNvSpPr/>
-                        <wps:spPr>
-                          <a:xfrm>
-                            <a:off x="152400" y="8248664"/>
-                            <a:ext cx="319283" cy="557595"/>
-                          </a:xfrm>
-                          <a:prstGeom prst="rect">
-                            <a:avLst/>
-                          </a:prstGeom>
-                          <a:ln>
-                            <a:noFill/>
-                          </a:ln>
-                        </wps:spPr>
-                        <wps:txbx>
-                          <w:txbxContent>
-                            <w:p>
-                              <w:r>
-                                <w:rPr>
-                                  <w:rFonts w:ascii="Lucida Handwriting" w:eastAsia="Lucida Handwriting" w:hAnsi="Lucida Handwriting" w:cs="Lucida Handwriting"/>
-                                  <w:i/>
-                                  <w:sz w:val="56"/>
-                                </w:rPr>
-                                <w:t xml:space="preserve">  </w:t>
-                              </w:r>
-                            </w:p>
-                          </w:txbxContent>
-                        </wps:txbx>
-                        <wps:bodyPr horzOverflow="overflow" vert="horz" lIns="0" tIns="0" rIns="0" bIns="0" rtlCol="0">
-                          <a:noAutofit/>
-                        </wps:bodyPr>
-                      </wps:wsp>
-                      <wps:wsp>
-                        <wps:cNvPr id="47" name="Rectangle 47"/>
-                        <wps:cNvSpPr/>
-                        <wps:spPr>
-                          <a:xfrm>
-                            <a:off x="393192" y="8293917"/>
-                            <a:ext cx="1289304" cy="443448"/>
-                          </a:xfrm>
-                          <a:prstGeom prst="rect">
-                            <a:avLst/>
-                          </a:prstGeom>
-                          <a:ln>
-                            <a:noFill/>
-                          </a:ln>
-                        </wps:spPr>
-                        <wps:txbx>
-                          <w:txbxContent>
-                            <w:p>
+                              <w:pPr>
+                                <w:tabs>
+                                  <w:tab w:val="left" w:pos="2500"/>
+                                  <w:tab w:val="left" w:pos="2850"/>
+                                </w:tabs>
+                                <w:spacing w:line="910" w:lineRule="exact" w:before="0" w:after="0"/>
+                              </w:pPr>
                               <w:r>
                                 <w:rPr>
                                   <w:rFonts w:ascii="Arial Rounded MT" w:eastAsia="Arial Rounded MT" w:hAnsi="Arial Rounded MT" w:cs="Arial Rounded MT"/>
@@ -1255,186 +658,9 @@
                                 </w:rPr>
                                 <w:t>YEAR</w:t>
                               </w:r>
-                            </w:p>
-                          </w:txbxContent>
-                        </wps:txbx>
-                        <wps:bodyPr horzOverflow="overflow" vert="horz" lIns="0" tIns="0" rIns="0" bIns="0" rtlCol="0">
-                          <a:noAutofit/>
-                        </wps:bodyPr>
-                      </wps:wsp>
-                      <wps:wsp>
-                        <wps:cNvPr id="48" name="Rectangle 48"/>
-                        <wps:cNvSpPr/>
-                        <wps:spPr>
-                          <a:xfrm>
-                            <a:off x="1364234" y="8293917"/>
-                            <a:ext cx="118068" cy="443448"/>
-                          </a:xfrm>
-                          <a:prstGeom prst="rect">
-                            <a:avLst/>
-                          </a:prstGeom>
-                          <a:ln>
-                            <a:noFill/>
-                          </a:ln>
-                        </wps:spPr>
-                        <wps:txbx>
-                          <w:txbxContent>
-                            <w:p>
                               <w:r>
-                                <w:rPr>
-                                  <w:rFonts w:ascii="Arial Rounded MT" w:eastAsia="Arial Rounded MT" w:hAnsi="Arial Rounded MT" w:cs="Arial Rounded MT"/>
-                                  <w:b/>
-                                  <w:sz w:val="56"/>
-                                </w:rPr>
-                                <w:t xml:space="preserve"> </w:t>
+                                <w:tab/>
                               </w:r>
-                            </w:p>
-                          </w:txbxContent>
-                        </wps:txbx>
-                        <wps:bodyPr horzOverflow="overflow" vert="horz" lIns="0" tIns="0" rIns="0" bIns="0" rtlCol="0">
-                          <a:noAutofit/>
-                        </wps:bodyPr>
-                      </wps:wsp>
-                      <wps:wsp>
-                        <wps:cNvPr id="49" name="Rectangle 49"/>
-                        <wps:cNvSpPr/>
-                        <wps:spPr>
-                          <a:xfrm>
-                            <a:off x="1452626" y="8447278"/>
-                            <a:ext cx="42144" cy="189936"/>
-                          </a:xfrm>
-                          <a:prstGeom prst="rect">
-                            <a:avLst/>
-                          </a:prstGeom>
-                          <a:ln>
-                            <a:noFill/>
-                          </a:ln>
-                        </wps:spPr>
-                        <wps:txbx>
-                          <w:txbxContent>
-                            <w:p>
-                              <w:r>
-                                <w:t xml:space="preserve"> </w:t>
-                              </w:r>
-                            </w:p>
-                          </w:txbxContent>
-                        </wps:txbx>
-                        <wps:bodyPr horzOverflow="overflow" vert="horz" lIns="0" tIns="0" rIns="0" bIns="0" rtlCol="0">
-                          <a:noAutofit/>
-                        </wps:bodyPr>
-                      </wps:wsp>
-                      <wps:wsp>
-                        <wps:cNvPr id="50" name="Rectangle 50"/>
-                        <wps:cNvSpPr/>
-                        <wps:spPr>
-                          <a:xfrm>
-                            <a:off x="1524254" y="8293917"/>
-                            <a:ext cx="118068" cy="443448"/>
-                          </a:xfrm>
-                          <a:prstGeom prst="rect">
-                            <a:avLst/>
-                          </a:prstGeom>
-                          <a:ln>
-                            <a:noFill/>
-                          </a:ln>
-                        </wps:spPr>
-                        <wps:txbx>
-                          <w:txbxContent>
-                            <w:p>
-                              <w:r>
-                                <w:rPr>
-                                  <w:rFonts w:ascii="Arial Rounded MT" w:eastAsia="Arial Rounded MT" w:hAnsi="Arial Rounded MT" w:cs="Arial Rounded MT"/>
-                                  <w:b/>
-                                  <w:sz w:val="56"/>
-                                </w:rPr>
-                                <w:t xml:space="preserve"> </w:t>
-                              </w:r>
-                            </w:p>
-                          </w:txbxContent>
-                        </wps:txbx>
-                        <wps:bodyPr horzOverflow="overflow" vert="horz" lIns="0" tIns="0" rIns="0" bIns="0" rtlCol="0">
-                          <a:noAutofit/>
-                        </wps:bodyPr>
-                      </wps:wsp>
-                      <wps:wsp>
-                        <wps:cNvPr id="51" name="Rectangle 51"/>
-                        <wps:cNvSpPr/>
-                        <wps:spPr>
-                          <a:xfrm>
-                            <a:off x="1612646" y="8447278"/>
-                            <a:ext cx="42144" cy="189936"/>
-                          </a:xfrm>
-                          <a:prstGeom prst="rect">
-                            <a:avLst/>
-                          </a:prstGeom>
-                          <a:ln>
-                            <a:noFill/>
-                          </a:ln>
-                        </wps:spPr>
-                        <wps:txbx>
-                          <w:txbxContent>
-                            <w:p>
-                              <w:r>
-                                <w:t xml:space="preserve"> </w:t>
-                              </w:r>
-                            </w:p>
-                          </w:txbxContent>
-                        </wps:txbx>
-                        <wps:bodyPr horzOverflow="overflow" vert="horz" lIns="0" tIns="0" rIns="0" bIns="0" rtlCol="0">
-                          <a:noAutofit/>
-                        </wps:bodyPr>
-                      </wps:wsp>
-                      <wps:wsp>
-                        <wps:cNvPr id="52" name="Rectangle 52"/>
-                        <wps:cNvSpPr/>
-                        <wps:spPr>
-                          <a:xfrm>
-                            <a:off x="1981454" y="8293917"/>
-                            <a:ext cx="118068" cy="443448"/>
-                          </a:xfrm>
-                          <a:prstGeom prst="rect">
-                            <a:avLst/>
-                          </a:prstGeom>
-                          <a:ln>
-                            <a:noFill/>
-                          </a:ln>
-                        </wps:spPr>
-                        <wps:txbx>
-                          <w:txbxContent>
-                            <w:p>
-                              <w:r>
-                                <w:rPr>
-                                  <w:rFonts w:ascii="Arial Rounded MT" w:eastAsia="Arial Rounded MT" w:hAnsi="Arial Rounded MT" w:cs="Arial Rounded MT"/>
-                                  <w:b/>
-                                  <w:sz w:val="56"/>
-                                </w:rPr>
-                                <w:t xml:space="preserve"> </w:t>
-                              </w:r>
-                            </w:p>
-                          </w:txbxContent>
-                        </wps:txbx>
-                        <wps:bodyPr horzOverflow="overflow" vert="horz" lIns="0" tIns="0" rIns="0" bIns="0" rtlCol="0">
-                          <a:noAutofit/>
-                        </wps:bodyPr>
-                      </wps:wsp>
-                      <wps:wsp>
-                        <wps:cNvPr id="53" name="Rectangle 53"/>
-                        <wps:cNvSpPr/>
-                        <wps:spPr>
-                          <a:xfrm>
-                            <a:off x="2069846" y="8293917"/>
-                            <a:ext cx="147821" cy="443448"/>
-                          </a:xfrm>
-                          <a:prstGeom prst="rect">
-                            <a:avLst/>
-                          </a:prstGeom>
-                          <a:ln>
-                            <a:noFill/>
-                          </a:ln>
-                        </wps:spPr>
-                        <wps:txbx>
-                          <w:txbxContent>
-                            <w:p>
                               <w:r>
                                 <w:rPr>
                                   <w:rFonts w:ascii="Arial Rounded MT" w:eastAsia="Arial Rounded MT" w:hAnsi="Arial Rounded MT" w:cs="Arial Rounded MT"/>
@@ -1443,64 +669,9 @@
                                 </w:rPr>
                                 <w:t>:</w:t>
                               </w:r>
-                            </w:p>
-                          </w:txbxContent>
-                        </wps:txbx>
-                        <wps:bodyPr horzOverflow="overflow" vert="horz" lIns="0" tIns="0" rIns="0" bIns="0" rtlCol="0">
-                          <a:noAutofit/>
-                        </wps:bodyPr>
-                      </wps:wsp>
-                      <wps:wsp>
-                        <wps:cNvPr id="54" name="Rectangle 54"/>
-                        <wps:cNvSpPr/>
-                        <wps:spPr>
-                          <a:xfrm>
-                            <a:off x="2181479" y="8248664"/>
-                            <a:ext cx="159156" cy="557595"/>
-                          </a:xfrm>
-                          <a:prstGeom prst="rect">
-                            <a:avLst/>
-                          </a:prstGeom>
-                          <a:ln>
-                            <a:noFill/>
-                          </a:ln>
-                        </wps:spPr>
-                        <wps:txbx>
-                          <w:txbxContent>
-                            <w:p>
                               <w:r>
-                                <w:rPr>
-                                  <w:rFonts w:ascii="Lucida Handwriting" w:eastAsia="Lucida Handwriting" w:hAnsi="Lucida Handwriting" w:cs="Lucida Handwriting"/>
-                                  <w:i/>
-                                  <w:sz w:val="56"/>
-                                </w:rPr>
-                                <w:t xml:space="preserve"> </w:t>
+                                <w:tab/>
                               </w:r>
-                            </w:p>
-                          </w:txbxContent>
-                        </wps:txbx>
-                        <wps:bodyPr horzOverflow="overflow" vert="horz" lIns="0" tIns="0" rIns="0" bIns="0" rtlCol="0">
-                          <a:noAutofit/>
-                        </wps:bodyPr>
-                      </wps:wsp>
-                      <wps:wsp>
-                        <wps:cNvPr id="962" name="Rectangle 962"/>
-                        <wps:cNvSpPr/>
-                        <wps:spPr>
-                          <a:xfrm>
-                            <a:off x="2301875" y="8276232"/>
-                            <a:ext cx="839015" cy="472273"/>
-                          </a:xfrm>
-                          <a:prstGeom prst="rect">
-                            <a:avLst/>
-                          </a:prstGeom>
-                          <a:ln>
-                            <a:noFill/>
-                          </a:ln>
-                        </wps:spPr>
-                        <wps:txbx>
-                          <w:txbxContent>
-                            <w:p>
                               <w:r>
                                 <w:rPr>
                                   <w:rFonts w:ascii="Cambria" w:eastAsia="Cambria" w:hAnsi="Cambria" w:cs="Cambria"/>
@@ -1508,33 +679,39 @@
                                   <w:sz w:val="56"/>
                                   <w:u w:val="single" w:color="000000"/>
                                 </w:rPr>
-                                <w:t>202</w:t>
+                                <w:t>2026-27</w:t>
                               </w:r>
                             </w:p>
-                          </w:txbxContent>
-                        </wps:txbx>
-                        <wps:bodyPr horzOverflow="overflow" vert="horz" lIns="0" tIns="0" rIns="0" bIns="0" rtlCol="0">
-                          <a:noAutofit/>
-                        </wps:bodyPr>
-                      </wps:wsp>
-                      <wps:wsp>
-                        <wps:cNvPr id="963" name="Rectangle 963"/>
-                        <wps:cNvSpPr/>
-                        <wps:spPr>
-                          <a:xfrm>
-                            <a:off x="2932811" y="8276232"/>
-                            <a:ext cx="279585" cy="472273"/>
-                          </a:xfrm>
-                          <a:prstGeom prst="rect">
-                            <a:avLst/>
-                          </a:prstGeom>
-                          <a:ln>
-                            <a:noFill/>
-                          </a:ln>
-                        </wps:spPr>
-                        <wps:txbx>
-                          <w:txbxContent>
                             <w:p>
+                              <w:pPr>
+                                <w:tabs>
+                                  <w:tab w:val="left" w:pos="2500"/>
+                                  <w:tab w:val="left" w:pos="2850"/>
+                                </w:tabs>
+                                <w:spacing w:line="910" w:lineRule="exact" w:before="0" w:after="0"/>
+                              </w:pPr>
+                              <w:r>
+                                <w:rPr>
+                                  <w:rFonts w:ascii="Arial Rounded MT" w:eastAsia="Arial Rounded MT" w:hAnsi="Arial Rounded MT" w:cs="Arial Rounded MT"/>
+                                  <w:b/>
+                                  <w:sz w:val="56"/>
+                                </w:rPr>
+                                <w:t>FILE</w:t>
+                              </w:r>
+                              <w:r>
+                                <w:tab/>
+                              </w:r>
+                              <w:r>
+                                <w:rPr>
+                                  <w:rFonts w:ascii="Arial Rounded MT" w:eastAsia="Arial Rounded MT" w:hAnsi="Arial Rounded MT" w:cs="Arial Rounded MT"/>
+                                  <w:b/>
+                                  <w:sz w:val="56"/>
+                                </w:rPr>
+                                <w:t>:</w:t>
+                              </w:r>
+                              <w:r>
+                                <w:tab/>
+                              </w:r>
                               <w:r>
                                 <w:rPr>
                                   <w:rFonts w:ascii="Cambria" w:eastAsia="Cambria" w:hAnsi="Cambria" w:cs="Cambria"/>
@@ -1542,695 +719,38 @@
                                   <w:sz w:val="56"/>
                                   <w:u w:val="single" w:color="000000"/>
                                 </w:rPr>
-                                <w:t>6</w:t>
+                                <w:t>Project</w:t>
                               </w:r>
                             </w:p>
-                          </w:txbxContent>
-                        </wps:txbx>
-                        <wps:bodyPr horzOverflow="overflow" vert="horz" lIns="0" tIns="0" rIns="0" bIns="0" rtlCol="0">
-                          <a:noAutofit/>
-                        </wps:bodyPr>
-                      </wps:wsp>
-                      <wps:wsp>
-                        <wps:cNvPr id="964" name="Rectangle 964"/>
-                        <wps:cNvSpPr/>
-                        <wps:spPr>
-                          <a:xfrm>
-                            <a:off x="3143123" y="8276232"/>
-                            <a:ext cx="159156" cy="472273"/>
-                          </a:xfrm>
-                          <a:prstGeom prst="rect">
-                            <a:avLst/>
-                          </a:prstGeom>
-                          <a:ln>
-                            <a:noFill/>
-                          </a:ln>
-                        </wps:spPr>
-                        <wps:txbx>
-                          <w:txbxContent>
                             <w:p>
+                              <w:pPr>
+                                <w:tabs>
+                                  <w:tab w:val="left" w:pos="2500"/>
+                                  <w:tab w:val="left" w:pos="2850"/>
+                                </w:tabs>
+                                <w:spacing w:line="910" w:lineRule="exact" w:before="0" w:after="0"/>
+                              </w:pPr>
                               <w:r>
                                 <w:rPr>
-                                  <w:rFonts w:ascii="Cambria" w:eastAsia="Cambria" w:hAnsi="Cambria" w:cs="Cambria"/>
-                                  <w:b/>
-                                  <w:sz w:val="56"/>
-                                  <w:u w:val="single" w:color="000000"/>
-                                </w:rPr>
-                                <w:t>-</w:t>
-                              </w:r>
-                            </w:p>
-                          </w:txbxContent>
-                        </wps:txbx>
-                        <wps:bodyPr horzOverflow="overflow" vert="horz" lIns="0" tIns="0" rIns="0" bIns="0" rtlCol="0">
-                          <a:noAutofit/>
-                        </wps:bodyPr>
-                      </wps:wsp>
-                      <wps:wsp>
-                        <wps:cNvPr id="965" name="Rectangle 965"/>
-                        <wps:cNvSpPr/>
-                        <wps:spPr>
-                          <a:xfrm>
-                            <a:off x="3263519" y="8276232"/>
-                            <a:ext cx="279585" cy="472273"/>
-                          </a:xfrm>
-                          <a:prstGeom prst="rect">
-                            <a:avLst/>
-                          </a:prstGeom>
-                          <a:ln>
-                            <a:noFill/>
-                          </a:ln>
-                        </wps:spPr>
-                        <wps:txbx>
-                          <w:txbxContent>
-                            <w:p>
-                              <w:r>
-                                <w:rPr>
-                                  <w:rFonts w:ascii="Cambria" w:eastAsia="Cambria" w:hAnsi="Cambria" w:cs="Cambria"/>
-                                  <w:b/>
-                                  <w:sz w:val="56"/>
-                                  <w:u w:val="single" w:color="000000"/>
-                                </w:rPr>
-                                <w:t>2</w:t>
-                              </w:r>
-                            </w:p>
-                          </w:txbxContent>
-                        </wps:txbx>
-                        <wps:bodyPr horzOverflow="overflow" vert="horz" lIns="0" tIns="0" rIns="0" bIns="0" rtlCol="0">
-                          <a:noAutofit/>
-                        </wps:bodyPr>
-                      </wps:wsp>
-                      <wps:wsp>
-                        <wps:cNvPr id="966" name="Rectangle 966"/>
-                        <wps:cNvSpPr/>
-                        <wps:spPr>
-                          <a:xfrm>
-                            <a:off x="3475355" y="8276232"/>
-                            <a:ext cx="279585" cy="472273"/>
-                          </a:xfrm>
-                          <a:prstGeom prst="rect">
-                            <a:avLst/>
-                          </a:prstGeom>
-                          <a:ln>
-                            <a:noFill/>
-                          </a:ln>
-                        </wps:spPr>
-                        <wps:txbx>
-                          <w:txbxContent>
-                            <w:p>
-                              <w:r>
-                                <w:rPr>
-                                  <w:rFonts w:ascii="Cambria" w:eastAsia="Cambria" w:hAnsi="Cambria" w:cs="Cambria"/>
-                                  <w:b/>
-                                  <w:sz w:val="56"/>
-                                  <w:u w:val="single" w:color="000000"/>
-                                </w:rPr>
-                                <w:t>7</w:t>
-                              </w:r>
-                            </w:p>
-                          </w:txbxContent>
-                        </wps:txbx>
-                        <wps:bodyPr horzOverflow="overflow" vert="horz" lIns="0" tIns="0" rIns="0" bIns="0" rtlCol="0">
-                          <a:noAutofit/>
-                        </wps:bodyPr>
-                      </wps:wsp>
-                      <wps:wsp>
-                        <wps:cNvPr id="967" name="Rectangle 967"/>
-                        <wps:cNvSpPr/>
-                        <wps:spPr>
-                          <a:xfrm>
-                            <a:off x="3685667" y="8447278"/>
-                            <a:ext cx="42143" cy="189936"/>
-                          </a:xfrm>
-                          <a:prstGeom prst="rect">
-                            <a:avLst/>
-                          </a:prstGeom>
-                          <a:ln>
-                            <a:noFill/>
-                          </a:ln>
-                        </wps:spPr>
-                        <wps:txbx>
-                          <w:txbxContent>
-                            <w:p>
-                              <w:r>
-                                <w:t xml:space="preserve"> </w:t>
-                              </w:r>
-                            </w:p>
-                          </w:txbxContent>
-                        </wps:txbx>
-                        <wps:bodyPr horzOverflow="overflow" vert="horz" lIns="0" tIns="0" rIns="0" bIns="0" rtlCol="0">
-                          <a:noAutofit/>
-                        </wps:bodyPr>
-                      </wps:wsp>
-                      <wps:wsp>
-                        <wps:cNvPr id="62" name="Rectangle 62"/>
-                        <wps:cNvSpPr/>
-                        <wps:spPr>
-                          <a:xfrm>
-                            <a:off x="152400" y="8908641"/>
-                            <a:ext cx="103900" cy="472273"/>
-                          </a:xfrm>
-                          <a:prstGeom prst="rect">
-                            <a:avLst/>
-                          </a:prstGeom>
-                          <a:ln>
-                            <a:noFill/>
-                          </a:ln>
-                        </wps:spPr>
-                        <wps:txbx>
-                          <w:txbxContent>
-                            <w:p>
-                              <w:r>
-                                <w:rPr>
-                                  <w:rFonts w:ascii="Cambria" w:eastAsia="Cambria" w:hAnsi="Cambria" w:cs="Cambria"/>
+                                  <w:rFonts w:ascii="Arial Rounded MT" w:eastAsia="Arial Rounded MT" w:hAnsi="Arial Rounded MT" w:cs="Arial Rounded MT"/>
                                   <w:b/>
                                   <w:sz w:val="56"/>
                                 </w:rPr>
-                                <w:t xml:space="preserve"> </w:t>
+                                <w:t>ROLL</w:t>
                               </w:r>
-                            </w:p>
-                          </w:txbxContent>
-                        </wps:txbx>
-                        <wps:bodyPr horzOverflow="overflow" vert="horz" lIns="0" tIns="0" rIns="0" bIns="0" rtlCol="0">
-                          <a:noAutofit/>
-                        </wps:bodyPr>
-                      </wps:wsp>
-                      <wps:wsp>
-                        <wps:cNvPr id="63" name="Rectangle 63"/>
-                        <wps:cNvSpPr/>
-                        <wps:spPr>
-                          <a:xfrm>
-                            <a:off x="230124" y="8908641"/>
-                            <a:ext cx="207273" cy="472273"/>
-                          </a:xfrm>
-                          <a:prstGeom prst="rect">
-                            <a:avLst/>
-                          </a:prstGeom>
-                          <a:ln>
-                            <a:noFill/>
-                          </a:ln>
-                        </wps:spPr>
-                        <wps:txbx>
-                          <w:txbxContent>
-                            <w:p>
+                              <w:r>
+                                <w:tab/>
+                              </w:r>
                               <w:r>
                                 <w:rPr>
-                                  <w:rFonts w:ascii="Cambria" w:eastAsia="Cambria" w:hAnsi="Cambria" w:cs="Cambria"/>
-                                  <w:b/>
-                                  <w:sz w:val="56"/>
-                                </w:rPr>
-                                <w:t xml:space="preserve">  </w:t>
-                              </w:r>
-                            </w:p>
-                          </w:txbxContent>
-                        </wps:txbx>
-                        <wps:bodyPr horzOverflow="overflow" vert="horz" lIns="0" tIns="0" rIns="0" bIns="0" rtlCol="0">
-                          <a:noAutofit/>
-                        </wps:bodyPr>
-                      </wps:wsp>
-                      <wps:wsp>
-                        <wps:cNvPr id="64" name="Rectangle 64"/>
-                        <wps:cNvSpPr/>
-                        <wps:spPr>
-                          <a:xfrm>
-                            <a:off x="387096" y="8908641"/>
-                            <a:ext cx="103900" cy="472273"/>
-                          </a:xfrm>
-                          <a:prstGeom prst="rect">
-                            <a:avLst/>
-                          </a:prstGeom>
-                          <a:ln>
-                            <a:noFill/>
-                          </a:ln>
-                        </wps:spPr>
-                        <wps:txbx>
-                          <w:txbxContent>
-                            <w:p>
-                              <w:r>
-                                <w:rPr>
-                                  <w:rFonts w:ascii="Cambria" w:eastAsia="Cambria" w:hAnsi="Cambria" w:cs="Cambria"/>
-                                  <w:b/>
-                                  <w:sz w:val="56"/>
-                                </w:rPr>
-                                <w:t xml:space="preserve"> </w:t>
-                              </w:r>
-                            </w:p>
-                          </w:txbxContent>
-                        </wps:txbx>
-                        <wps:bodyPr horzOverflow="overflow" vert="horz" lIns="0" tIns="0" rIns="0" bIns="0" rtlCol="0">
-                          <a:noAutofit/>
-                        </wps:bodyPr>
-                      </wps:wsp>
-                      <wps:wsp>
-                        <wps:cNvPr id="65" name="Rectangle 65"/>
-                        <wps:cNvSpPr/>
-                        <wps:spPr>
-                          <a:xfrm>
-                            <a:off x="464820" y="8908641"/>
-                            <a:ext cx="958713" cy="472273"/>
-                          </a:xfrm>
-                          <a:prstGeom prst="rect">
-                            <a:avLst/>
-                          </a:prstGeom>
-                          <a:ln>
-                            <a:noFill/>
-                          </a:ln>
-                        </wps:spPr>
-                        <wps:txbx>
-                          <w:txbxContent>
-                            <w:p>
-                              <w:r>
-                                <w:rPr>
-                                  <w:rFonts w:ascii="Cambria" w:eastAsia="Cambria" w:hAnsi="Cambria" w:cs="Cambria"/>
-                                  <w:b/>
-                                  <w:sz w:val="56"/>
-                                </w:rPr>
-                                <w:t>FILE</w:t>
-                              </w:r>
-                            </w:p>
-                          </w:txbxContent>
-                        </wps:txbx>
-                        <wps:bodyPr horzOverflow="overflow" vert="horz" lIns="0" tIns="0" rIns="0" bIns="0" rtlCol="0">
-                          <a:noAutofit/>
-                        </wps:bodyPr>
-                      </wps:wsp>
-                      <wps:wsp>
-                        <wps:cNvPr id="66" name="Rectangle 66"/>
-                        <wps:cNvSpPr/>
-                        <wps:spPr>
-                          <a:xfrm>
-                            <a:off x="1185926" y="8908641"/>
-                            <a:ext cx="103900" cy="472273"/>
-                          </a:xfrm>
-                          <a:prstGeom prst="rect">
-                            <a:avLst/>
-                          </a:prstGeom>
-                          <a:ln>
-                            <a:noFill/>
-                          </a:ln>
-                        </wps:spPr>
-                        <wps:txbx>
-                          <w:txbxContent>
-                            <w:p>
-                              <w:r>
-                                <w:rPr>
-                                  <w:rFonts w:ascii="Cambria" w:eastAsia="Cambria" w:hAnsi="Cambria" w:cs="Cambria"/>
-                                  <w:b/>
-                                  <w:sz w:val="56"/>
-                                </w:rPr>
-                                <w:t xml:space="preserve"> </w:t>
-                              </w:r>
-                            </w:p>
-                          </w:txbxContent>
-                        </wps:txbx>
-                        <wps:bodyPr horzOverflow="overflow" vert="horz" lIns="0" tIns="0" rIns="0" bIns="0" rtlCol="0">
-                          <a:noAutofit/>
-                        </wps:bodyPr>
-                      </wps:wsp>
-                      <wps:wsp>
-                        <wps:cNvPr id="67" name="Rectangle 67"/>
-                        <wps:cNvSpPr/>
-                        <wps:spPr>
-                          <a:xfrm>
-                            <a:off x="1265174" y="8908641"/>
-                            <a:ext cx="936044" cy="472273"/>
-                          </a:xfrm>
-                          <a:prstGeom prst="rect">
-                            <a:avLst/>
-                          </a:prstGeom>
-                          <a:ln>
-                            <a:noFill/>
-                          </a:ln>
-                        </wps:spPr>
-                        <wps:txbx>
-                          <w:txbxContent>
-                            <w:p>
-                              <w:r>
-                                <w:rPr>
-                                  <w:rFonts w:ascii="Cambria" w:eastAsia="Cambria" w:hAnsi="Cambria" w:cs="Cambria"/>
-                                  <w:b/>
-                                  <w:sz w:val="56"/>
-                                </w:rPr>
-                                <w:t xml:space="preserve">         </w:t>
-                              </w:r>
-                            </w:p>
-                          </w:txbxContent>
-                        </wps:txbx>
-                        <wps:bodyPr horzOverflow="overflow" vert="horz" lIns="0" tIns="0" rIns="0" bIns="0" rtlCol="0">
-                          <a:noAutofit/>
-                        </wps:bodyPr>
-                      </wps:wsp>
-                      <wps:wsp>
-                        <wps:cNvPr id="68" name="Rectangle 68"/>
-                        <wps:cNvSpPr/>
-                        <wps:spPr>
-                          <a:xfrm>
-                            <a:off x="1969262" y="8908641"/>
-                            <a:ext cx="207273" cy="472273"/>
-                          </a:xfrm>
-                          <a:prstGeom prst="rect">
-                            <a:avLst/>
-                          </a:prstGeom>
-                          <a:ln>
-                            <a:noFill/>
-                          </a:ln>
-                        </wps:spPr>
-                        <wps:txbx>
-                          <w:txbxContent>
-                            <w:p>
-                              <w:r>
-                                <w:rPr>
-                                  <w:rFonts w:ascii="Cambria" w:eastAsia="Cambria" w:hAnsi="Cambria" w:cs="Cambria"/>
-                                  <w:b/>
-                                  <w:sz w:val="56"/>
-                                </w:rPr>
-                                <w:t xml:space="preserve">  </w:t>
-                              </w:r>
-                            </w:p>
-                          </w:txbxContent>
-                        </wps:txbx>
-                        <wps:bodyPr horzOverflow="overflow" vert="horz" lIns="0" tIns="0" rIns="0" bIns="0" rtlCol="0">
-                          <a:noAutofit/>
-                        </wps:bodyPr>
-                      </wps:wsp>
-                      <wps:wsp>
-                        <wps:cNvPr id="69" name="Rectangle 69"/>
-                        <wps:cNvSpPr/>
-                        <wps:spPr>
-                          <a:xfrm>
-                            <a:off x="2126234" y="8908641"/>
-                            <a:ext cx="132236" cy="472273"/>
-                          </a:xfrm>
-                          <a:prstGeom prst="rect">
-                            <a:avLst/>
-                          </a:prstGeom>
-                          <a:ln>
-                            <a:noFill/>
-                          </a:ln>
-                        </wps:spPr>
-                        <wps:txbx>
-                          <w:txbxContent>
-                            <w:p>
-                              <w:r>
-                                <w:rPr>
-                                  <w:rFonts w:ascii="Cambria" w:eastAsia="Cambria" w:hAnsi="Cambria" w:cs="Cambria"/>
+                                  <w:rFonts w:ascii="Arial Rounded MT" w:eastAsia="Arial Rounded MT" w:hAnsi="Arial Rounded MT" w:cs="Arial Rounded MT"/>
                                   <w:b/>
                                   <w:sz w:val="56"/>
                                 </w:rPr>
                                 <w:t>:</w:t>
                               </w:r>
-                            </w:p>
-                          </w:txbxContent>
-                        </wps:txbx>
-                        <wps:bodyPr horzOverflow="overflow" vert="horz" lIns="0" tIns="0" rIns="0" bIns="0" rtlCol="0">
-                          <a:noAutofit/>
-                        </wps:bodyPr>
-                      </wps:wsp>
-                      <wps:wsp>
-                        <wps:cNvPr id="970" name="Rectangle 970"/>
-                        <wps:cNvSpPr/>
-                        <wps:spPr>
-                          <a:xfrm>
-                            <a:off x="2225675" y="8908641"/>
-                            <a:ext cx="103900" cy="472273"/>
-                          </a:xfrm>
-                          <a:prstGeom prst="rect">
-                            <a:avLst/>
-                          </a:prstGeom>
-                          <a:ln>
-                            <a:noFill/>
-                          </a:ln>
-                        </wps:spPr>
-                        <wps:txbx>
-                          <w:txbxContent>
-                            <w:p>
                               <w:r>
-                                <w:rPr>
-                                  <w:rFonts w:ascii="Cambria" w:eastAsia="Cambria" w:hAnsi="Cambria" w:cs="Cambria"/>
-                                  <w:b/>
-                                  <w:sz w:val="56"/>
-                                </w:rPr>
-                                <w:t xml:space="preserve"> </w:t>
-                              </w:r>
-                            </w:p>
-                          </w:txbxContent>
-                        </wps:txbx>
-                        <wps:bodyPr horzOverflow="overflow" vert="horz" lIns="0" tIns="0" rIns="0" bIns="0" rtlCol="0">
-                          <a:noAutofit/>
-                        </wps:bodyPr>
-                      </wps:wsp>
-                      <wps:wsp>
-                        <wps:cNvPr id="968" name="Rectangle 968"/>
-                        <wps:cNvSpPr/>
-                        <wps:spPr>
-                          <a:xfrm>
-                            <a:off x="2303399" y="8908641"/>
-                            <a:ext cx="289975" cy="472273"/>
-                          </a:xfrm>
-                          <a:prstGeom prst="rect">
-                            <a:avLst/>
-                          </a:prstGeom>
-                          <a:ln>
-                            <a:noFill/>
-                          </a:ln>
-                        </wps:spPr>
-                        <wps:txbx>
-                          <w:txbxContent>
-                            <w:p>
-                              <w:r>
-                                <w:rPr>
-                                  <w:rFonts w:ascii="Cambria" w:eastAsia="Cambria" w:hAnsi="Cambria" w:cs="Cambria"/>
-                                  <w:b/>
-                                  <w:sz w:val="56"/>
-                                  <w:u w:val="single" w:color="000000"/>
-                                </w:rPr>
-                                <w:t>P</w:t>
-                              </w:r>
-                            </w:p>
-                          </w:txbxContent>
-                        </wps:txbx>
-                        <wps:bodyPr horzOverflow="overflow" vert="horz" lIns="0" tIns="0" rIns="0" bIns="0" rtlCol="0">
-                          <a:noAutofit/>
-                        </wps:bodyPr>
-                      </wps:wsp>
-                      <wps:wsp>
-                        <wps:cNvPr id="969" name="Rectangle 969"/>
-                        <wps:cNvSpPr/>
-                        <wps:spPr>
-                          <a:xfrm>
-                            <a:off x="2521331" y="8908641"/>
-                            <a:ext cx="1276553" cy="472273"/>
-                          </a:xfrm>
-                          <a:prstGeom prst="rect">
-                            <a:avLst/>
-                          </a:prstGeom>
-                          <a:ln>
-                            <a:noFill/>
-                          </a:ln>
-                        </wps:spPr>
-                        <wps:txbx>
-                          <w:txbxContent>
-                            <w:p>
-                              <w:r>
-                                <w:rPr>
-                                  <w:rFonts w:ascii="Cambria" w:eastAsia="Cambria" w:hAnsi="Cambria" w:cs="Cambria"/>
-                                  <w:b/>
-                                  <w:sz w:val="56"/>
-                                  <w:u w:val="single" w:color="000000"/>
-                                </w:rPr>
-                                <w:t>roject</w:t>
-                              </w:r>
-                            </w:p>
-                          </w:txbxContent>
-                        </wps:txbx>
-                        <wps:bodyPr horzOverflow="overflow" vert="horz" lIns="0" tIns="0" rIns="0" bIns="0" rtlCol="0">
-                          <a:noAutofit/>
-                        </wps:bodyPr>
-                      </wps:wsp>
-                      <wps:wsp>
-                        <wps:cNvPr id="971" name="Rectangle 971"/>
-                        <wps:cNvSpPr/>
-                        <wps:spPr>
-                          <a:xfrm>
-                            <a:off x="3482975" y="8908641"/>
-                            <a:ext cx="103900" cy="472273"/>
-                          </a:xfrm>
-                          <a:prstGeom prst="rect">
-                            <a:avLst/>
-                          </a:prstGeom>
-                          <a:ln>
-                            <a:noFill/>
-                          </a:ln>
-                        </wps:spPr>
-                        <wps:txbx>
-                          <w:txbxContent>
-                            <w:p>
-                              <w:r>
-                                <w:rPr>
-                                  <w:rFonts w:ascii="Cambria" w:eastAsia="Cambria" w:hAnsi="Cambria" w:cs="Cambria"/>
-                                  <w:b/>
-                                  <w:sz w:val="56"/>
-                                </w:rPr>
-                                <w:t xml:space="preserve"> </w:t>
-                              </w:r>
-                            </w:p>
-                          </w:txbxContent>
-                        </wps:txbx>
-                        <wps:bodyPr horzOverflow="overflow" vert="horz" lIns="0" tIns="0" rIns="0" bIns="0" rtlCol="0">
-                          <a:noAutofit/>
-                        </wps:bodyPr>
-                      </wps:wsp>
-                      <wps:wsp>
-                        <wps:cNvPr id="75" name="Rectangle 75"/>
-                        <wps:cNvSpPr/>
-                        <wps:spPr>
-                          <a:xfrm>
-                            <a:off x="152400" y="9541101"/>
-                            <a:ext cx="103900" cy="472272"/>
-                          </a:xfrm>
-                          <a:prstGeom prst="rect">
-                            <a:avLst/>
-                          </a:prstGeom>
-                          <a:ln>
-                            <a:noFill/>
-                          </a:ln>
-                        </wps:spPr>
-                        <wps:txbx>
-                          <w:txbxContent>
-                            <w:p>
-                              <w:r>
-                                <w:rPr>
-                                  <w:rFonts w:ascii="Cambria" w:eastAsia="Cambria" w:hAnsi="Cambria" w:cs="Cambria"/>
-                                  <w:b/>
-                                  <w:sz w:val="56"/>
-                                </w:rPr>
-                                <w:t xml:space="preserve"> </w:t>
-                              </w:r>
-                            </w:p>
-                          </w:txbxContent>
-                        </wps:txbx>
-                        <wps:bodyPr horzOverflow="overflow" vert="horz" lIns="0" tIns="0" rIns="0" bIns="0" rtlCol="0">
-                          <a:noAutofit/>
-                        </wps:bodyPr>
-                      </wps:wsp>
-                      <wps:wsp>
-                        <wps:cNvPr id="76" name="Rectangle 76"/>
-                        <wps:cNvSpPr/>
-                        <wps:spPr>
-                          <a:xfrm>
-                            <a:off x="609905" y="9541101"/>
-                            <a:ext cx="1161318" cy="472272"/>
-                          </a:xfrm>
-                          <a:prstGeom prst="rect">
-                            <a:avLst/>
-                          </a:prstGeom>
-                          <a:ln>
-                            <a:noFill/>
-                          </a:ln>
-                        </wps:spPr>
-                        <wps:txbx>
-                          <w:txbxContent>
-                            <w:p>
-                              <w:r>
-                                <w:rPr>
-                                  <w:rFonts w:ascii="Cambria" w:eastAsia="Cambria" w:hAnsi="Cambria" w:cs="Cambria"/>
-                                  <w:b/>
-                                  <w:sz w:val="56"/>
-                                </w:rPr>
-                                <w:t>ROLL</w:t>
-                              </w:r>
-                            </w:p>
-                          </w:txbxContent>
-                        </wps:txbx>
-                        <wps:bodyPr horzOverflow="overflow" vert="horz" lIns="0" tIns="0" rIns="0" bIns="0" rtlCol="0">
-                          <a:noAutofit/>
-                        </wps:bodyPr>
-                      </wps:wsp>
-                      <wps:wsp>
-                        <wps:cNvPr id="77" name="Rectangle 77"/>
-                        <wps:cNvSpPr/>
-                        <wps:spPr>
-                          <a:xfrm>
-                            <a:off x="1483106" y="9541101"/>
-                            <a:ext cx="832616" cy="472272"/>
-                          </a:xfrm>
-                          <a:prstGeom prst="rect">
-                            <a:avLst/>
-                          </a:prstGeom>
-                          <a:ln>
-                            <a:noFill/>
-                          </a:ln>
-                        </wps:spPr>
-                        <wps:txbx>
-                          <w:txbxContent>
-                            <w:p>
-                              <w:r>
-                                <w:rPr>
-                                  <w:rFonts w:ascii="Cambria" w:eastAsia="Cambria" w:hAnsi="Cambria" w:cs="Cambria"/>
-                                  <w:b/>
-                                  <w:sz w:val="56"/>
-                                </w:rPr>
-                                <w:t xml:space="preserve">        </w:t>
-                              </w:r>
-                            </w:p>
-                          </w:txbxContent>
-                        </wps:txbx>
-                        <wps:bodyPr horzOverflow="overflow" vert="horz" lIns="0" tIns="0" rIns="0" bIns="0" rtlCol="0">
-                          <a:noAutofit/>
-                        </wps:bodyPr>
-                      </wps:wsp>
-                      <wps:wsp>
-                        <wps:cNvPr id="78" name="Rectangle 78"/>
-                        <wps:cNvSpPr/>
-                        <wps:spPr>
-                          <a:xfrm>
-                            <a:off x="2110994" y="9541101"/>
-                            <a:ext cx="132236" cy="472272"/>
-                          </a:xfrm>
-                          <a:prstGeom prst="rect">
-                            <a:avLst/>
-                          </a:prstGeom>
-                          <a:ln>
-                            <a:noFill/>
-                          </a:ln>
-                        </wps:spPr>
-                        <wps:txbx>
-                          <w:txbxContent>
-                            <w:p>
-                              <w:r>
-                                <w:rPr>
-                                  <w:rFonts w:ascii="Cambria" w:eastAsia="Cambria" w:hAnsi="Cambria" w:cs="Cambria"/>
-                                  <w:b/>
-                                  <w:sz w:val="56"/>
-                                </w:rPr>
-                                <w:t>:</w:t>
-                              </w:r>
-                            </w:p>
-                          </w:txbxContent>
-                        </wps:txbx>
-                        <wps:bodyPr horzOverflow="overflow" vert="horz" lIns="0" tIns="0" rIns="0" bIns="0" rtlCol="0">
-                          <a:noAutofit/>
-                        </wps:bodyPr>
-                      </wps:wsp>
-                      <wps:wsp>
-                        <wps:cNvPr id="79" name="Rectangle 79"/>
-                        <wps:cNvSpPr/>
-                        <wps:spPr>
-                          <a:xfrm>
-                            <a:off x="2210435" y="9712147"/>
-                            <a:ext cx="42144" cy="189937"/>
-                          </a:xfrm>
-                          <a:prstGeom prst="rect">
-                            <a:avLst/>
-                          </a:prstGeom>
-                          <a:ln>
-                            <a:noFill/>
-                          </a:ln>
-                        </wps:spPr>
-                        <wps:txbx>
-                          <w:txbxContent>
-                            <w:p>
-                              <w:r>
-                                <w:t xml:space="preserve"> </w:t>
+                                <w:tab/>
                               </w:r>
                             </w:p>
                           </w:txbxContent>

</xml_diff>